<commit_message>
feat: warehouse provenance and new_project.py --source bigquery (playbook v3.6.4)
</commit_message>
<xml_diff>
--- a/guide/Playbook_Quick_Start.docx
+++ b/guide/Playbook_Quick_Start.docx
@@ -367,7 +367,7 @@
                 <w:sz w:val="19"/>
                 <w:szCs w:val="19"/>
               </w:rPr>
-              <w:t xml:space="preserve">Raw data, with </w:t>
+              <w:t xml:space="preserve">Downloaded raw data, with </w:t>
             </w:r>
             <w:r>
               <w:rPr>
@@ -391,6 +391,13 @@
                 <w:szCs w:val="17"/>
               </w:rPr>
               <w:t xml:space="preserve">SHA256SUMS.txt</w:t>
+            </w:r>
+            <w:r>
+              <w:rPr>
+                <w:sz w:val="19"/>
+                <w:szCs w:val="19"/>
+              </w:rPr>
+              <w:t xml:space="preserve"> (data in BigQuery stays there)</w:t>
             </w:r>
           </w:p>
         </w:tc>
@@ -914,6 +921,58 @@
     </w:p>
     <w:p>
       <w:pPr>
+        <w:ind w:left="720"/>
+      </w:pPr>
+      <w:r>
+        <w:t xml:space="preserve">If the data stays in BigQuery instead of being downloaded, use </w:t>
+      </w:r>
+      <w:r>
+        <w:rPr>
+          <w:rFonts w:ascii="Menlo" w:cs="Menlo" w:eastAsia="Menlo" w:hAnsi="Menlo"/>
+          <w:sz w:val="18"/>
+          <w:szCs w:val="18"/>
+        </w:rPr>
+        <w:t xml:space="preserve">--source bigquery</w:t>
+      </w:r>
+      <w:r>
+        <w:t xml:space="preserve"> in place of </w:t>
+      </w:r>
+      <w:r>
+        <w:rPr>
+          <w:rFonts w:ascii="Menlo" w:cs="Menlo" w:eastAsia="Menlo" w:hAnsi="Menlo"/>
+          <w:sz w:val="18"/>
+          <w:szCs w:val="18"/>
+        </w:rPr>
+        <w:t xml:space="preserve">--data</w:t>
+      </w:r>
+      <w:r>
+        <w:t xml:space="preserve">. It adds the BigQuery packages, the BigQuery settings in </w:t>
+      </w:r>
+      <w:r>
+        <w:rPr>
+          <w:rFonts w:ascii="Menlo" w:cs="Menlo" w:eastAsia="Menlo" w:hAnsi="Menlo"/>
+          <w:sz w:val="18"/>
+          <w:szCs w:val="18"/>
+        </w:rPr>
+        <w:t xml:space="preserve">.env.example</w:t>
+      </w:r>
+      <w:r>
+        <w:t xml:space="preserve">, a </w:t>
+      </w:r>
+      <w:r>
+        <w:rPr>
+          <w:rFonts w:ascii="Menlo" w:cs="Menlo" w:eastAsia="Menlo" w:hAnsi="Menlo"/>
+          <w:sz w:val="18"/>
+          <w:szCs w:val="18"/>
+        </w:rPr>
+        <w:t xml:space="preserve">data/raw/SOURCE.txt</w:t>
+      </w:r>
+      <w:r>
+        <w:t xml:space="preserve"> to fill in, and a loading notebook that checks the tables against a snapshot instead of a checksum.</w:t>
+      </w:r>
+    </w:p>
+    <w:p>
+      <w:pPr>
         <w:pStyle w:val="ListParagraph"/>
         <w:numPr>
           <w:ilvl w:val="0"/>
@@ -982,6 +1041,58 @@
           <w:szCs w:val="17"/>
         </w:rPr>
         <w:t xml:space="preserve">cp .env.example .env</w:t>
+      </w:r>
+    </w:p>
+    <w:p>
+      <w:pPr>
+        <w:ind w:left="720"/>
+      </w:pPr>
+      <w:r>
+        <w:t xml:space="preserve">For a BigQuery project, also log in once per computer with </w:t>
+      </w:r>
+      <w:r>
+        <w:rPr>
+          <w:rFonts w:ascii="Menlo" w:cs="Menlo" w:eastAsia="Menlo" w:hAnsi="Menlo"/>
+          <w:sz w:val="18"/>
+          <w:szCs w:val="18"/>
+        </w:rPr>
+        <w:t xml:space="preserve">gcloud auth application-default login</w:t>
+      </w:r>
+      <w:r>
+        <w:t xml:space="preserve">, and fill in </w:t>
+      </w:r>
+      <w:r>
+        <w:rPr>
+          <w:rFonts w:ascii="Menlo" w:cs="Menlo" w:eastAsia="Menlo" w:hAnsi="Menlo"/>
+          <w:sz w:val="18"/>
+          <w:szCs w:val="18"/>
+        </w:rPr>
+        <w:t xml:space="preserve">GCP_PROJECT_ID</w:t>
+      </w:r>
+      <w:r>
+        <w:t xml:space="preserve"> and </w:t>
+      </w:r>
+      <w:r>
+        <w:rPr>
+          <w:rFonts w:ascii="Menlo" w:cs="Menlo" w:eastAsia="Menlo" w:hAnsi="Menlo"/>
+          <w:sz w:val="18"/>
+          <w:szCs w:val="18"/>
+        </w:rPr>
+        <w:t xml:space="preserve">BQ_SOURCE_DATASET</w:t>
+      </w:r>
+      <w:r>
+        <w:t xml:space="preserve"> in </w:t>
+      </w:r>
+      <w:r>
+        <w:rPr>
+          <w:rFonts w:ascii="Menlo" w:cs="Menlo" w:eastAsia="Menlo" w:hAnsi="Menlo"/>
+          <w:sz w:val="18"/>
+          <w:szCs w:val="18"/>
+        </w:rPr>
+        <w:t xml:space="preserve">.env</w:t>
+      </w:r>
+      <w:r>
+        <w:t xml:space="preserve">.</w:t>
       </w:r>
     </w:p>
     <w:p>
@@ -3514,7 +3625,7 @@
         <w:sz w:val="16"/>
         <w:szCs w:val="16"/>
       </w:rPr>
-      <w:t xml:space="preserve">Data Analysis Playbook v3.6.3 · Quick Start · page </w:t>
+      <w:t xml:space="preserve">Data Analysis Playbook v3.6.4 · Quick Start · page </w:t>
     </w:r>
     <w:r>
       <w:rPr>

</xml_diff>

<commit_message>
feat: warehouse provenance and new_project.py --source bigquery (playbook v3.6.4) (#12)
</commit_message>
<xml_diff>
--- a/guide/Playbook_Quick_Start.docx
+++ b/guide/Playbook_Quick_Start.docx
@@ -367,7 +367,7 @@
                 <w:sz w:val="19"/>
                 <w:szCs w:val="19"/>
               </w:rPr>
-              <w:t xml:space="preserve">Raw data, with </w:t>
+              <w:t xml:space="preserve">Downloaded raw data, with </w:t>
             </w:r>
             <w:r>
               <w:rPr>
@@ -391,6 +391,13 @@
                 <w:szCs w:val="17"/>
               </w:rPr>
               <w:t xml:space="preserve">SHA256SUMS.txt</w:t>
+            </w:r>
+            <w:r>
+              <w:rPr>
+                <w:sz w:val="19"/>
+                <w:szCs w:val="19"/>
+              </w:rPr>
+              <w:t xml:space="preserve"> (data in BigQuery stays there)</w:t>
             </w:r>
           </w:p>
         </w:tc>
@@ -914,6 +921,58 @@
     </w:p>
     <w:p>
       <w:pPr>
+        <w:ind w:left="720"/>
+      </w:pPr>
+      <w:r>
+        <w:t xml:space="preserve">If the data stays in BigQuery instead of being downloaded, use </w:t>
+      </w:r>
+      <w:r>
+        <w:rPr>
+          <w:rFonts w:ascii="Menlo" w:cs="Menlo" w:eastAsia="Menlo" w:hAnsi="Menlo"/>
+          <w:sz w:val="18"/>
+          <w:szCs w:val="18"/>
+        </w:rPr>
+        <w:t xml:space="preserve">--source bigquery</w:t>
+      </w:r>
+      <w:r>
+        <w:t xml:space="preserve"> in place of </w:t>
+      </w:r>
+      <w:r>
+        <w:rPr>
+          <w:rFonts w:ascii="Menlo" w:cs="Menlo" w:eastAsia="Menlo" w:hAnsi="Menlo"/>
+          <w:sz w:val="18"/>
+          <w:szCs w:val="18"/>
+        </w:rPr>
+        <w:t xml:space="preserve">--data</w:t>
+      </w:r>
+      <w:r>
+        <w:t xml:space="preserve">. It adds the BigQuery packages, the BigQuery settings in </w:t>
+      </w:r>
+      <w:r>
+        <w:rPr>
+          <w:rFonts w:ascii="Menlo" w:cs="Menlo" w:eastAsia="Menlo" w:hAnsi="Menlo"/>
+          <w:sz w:val="18"/>
+          <w:szCs w:val="18"/>
+        </w:rPr>
+        <w:t xml:space="preserve">.env.example</w:t>
+      </w:r>
+      <w:r>
+        <w:t xml:space="preserve">, a </w:t>
+      </w:r>
+      <w:r>
+        <w:rPr>
+          <w:rFonts w:ascii="Menlo" w:cs="Menlo" w:eastAsia="Menlo" w:hAnsi="Menlo"/>
+          <w:sz w:val="18"/>
+          <w:szCs w:val="18"/>
+        </w:rPr>
+        <w:t xml:space="preserve">data/raw/SOURCE.txt</w:t>
+      </w:r>
+      <w:r>
+        <w:t xml:space="preserve"> to fill in, and a loading notebook that checks the tables against a snapshot instead of a checksum.</w:t>
+      </w:r>
+    </w:p>
+    <w:p>
+      <w:pPr>
         <w:pStyle w:val="ListParagraph"/>
         <w:numPr>
           <w:ilvl w:val="0"/>
@@ -982,6 +1041,58 @@
           <w:szCs w:val="17"/>
         </w:rPr>
         <w:t xml:space="preserve">cp .env.example .env</w:t>
+      </w:r>
+    </w:p>
+    <w:p>
+      <w:pPr>
+        <w:ind w:left="720"/>
+      </w:pPr>
+      <w:r>
+        <w:t xml:space="preserve">For a BigQuery project, also log in once per computer with </w:t>
+      </w:r>
+      <w:r>
+        <w:rPr>
+          <w:rFonts w:ascii="Menlo" w:cs="Menlo" w:eastAsia="Menlo" w:hAnsi="Menlo"/>
+          <w:sz w:val="18"/>
+          <w:szCs w:val="18"/>
+        </w:rPr>
+        <w:t xml:space="preserve">gcloud auth application-default login</w:t>
+      </w:r>
+      <w:r>
+        <w:t xml:space="preserve">, and fill in </w:t>
+      </w:r>
+      <w:r>
+        <w:rPr>
+          <w:rFonts w:ascii="Menlo" w:cs="Menlo" w:eastAsia="Menlo" w:hAnsi="Menlo"/>
+          <w:sz w:val="18"/>
+          <w:szCs w:val="18"/>
+        </w:rPr>
+        <w:t xml:space="preserve">GCP_PROJECT_ID</w:t>
+      </w:r>
+      <w:r>
+        <w:t xml:space="preserve"> and </w:t>
+      </w:r>
+      <w:r>
+        <w:rPr>
+          <w:rFonts w:ascii="Menlo" w:cs="Menlo" w:eastAsia="Menlo" w:hAnsi="Menlo"/>
+          <w:sz w:val="18"/>
+          <w:szCs w:val="18"/>
+        </w:rPr>
+        <w:t xml:space="preserve">BQ_SOURCE_DATASET</w:t>
+      </w:r>
+      <w:r>
+        <w:t xml:space="preserve"> in </w:t>
+      </w:r>
+      <w:r>
+        <w:rPr>
+          <w:rFonts w:ascii="Menlo" w:cs="Menlo" w:eastAsia="Menlo" w:hAnsi="Menlo"/>
+          <w:sz w:val="18"/>
+          <w:szCs w:val="18"/>
+        </w:rPr>
+        <w:t xml:space="preserve">.env</w:t>
+      </w:r>
+      <w:r>
+        <w:t xml:space="preserve">.</w:t>
       </w:r>
     </w:p>
     <w:p>
@@ -3514,7 +3625,7 @@
         <w:sz w:val="16"/>
         <w:szCs w:val="16"/>
       </w:rPr>
-      <w:t xml:space="preserve">Data Analysis Playbook v3.6.3 · Quick Start · page </w:t>
+      <w:t xml:space="preserve">Data Analysis Playbook v3.6.4 · Quick Start · page </w:t>
     </w:r>
     <w:r>
       <w:rPr>

</xml_diff>